<commit_message>
Expand chapter heads and add linked sources including Nevo articles
Each summative assignment now has fuller anchor, article, thematic and
closing paragraphs, one Hebrew law-review article available on Nevo
(Albin 2016 / Nadiv 2022) replacing an English source, and clickable
links for every item in the search-documentation section and the
reference list.

Co-Authored-By: Claude Fable 5 <noreply@anthropic.com>
Claude-Session: https://claude.ai/code/session_01JBE53LuiqYDoXy9kPJLxew
</commit_message>
<xml_diff>
--- a/seminar-papers/עבודה מסכמת - קריאה וכתיבה אקדמית ב - הדר פוקס.docx
+++ b/seminar-papers/עבודה מסכמת - קריאה וכתיבה אקדמית ב - הדר פוקס.docx
@@ -259,8 +259,27 @@
           <w:szCs w:val="24"/>
           <w:rtl/>
         </w:rPr>
-        <w:t xml:space="preserve">(Sandefur, 2019) - מאמר אקדמי מכתב עת. אותר במנוע החיפוש Google Scholar באמצעות מילות החיפוש והאופרטורים: "access to justice" AND "legal aid" AND inequality.</w:t>
-      </w:r>
+        <w:t xml:space="preserve">(Sandefur, 2019) - מאמר אקדמי מכתב עת. אותר במנוע החיפוש Google Scholar באמצעות מילות החיפוש והאופרטורים: "access to justice" AND "legal aid" AND inequality. קישור למאמר:</w:t>
+      </w:r>
+    </w:p>
+    <w:p>
+      <w:pPr>
+        <w:bidi w:val="false"/>
+        <w:spacing w:after="120" w:line="360" w:lineRule="auto"/>
+        <w:ind w:left="709"/>
+        <w:jc w:val="left"/>
+      </w:pPr>
+      <w:hyperlink w:history="1" r:id="rIdphkzk54e1yqfxkhl0pn-9">
+        <w:r>
+          <w:rPr>
+            <w:rStyle w:val="Hyperlink"/>
+            <w:rFonts w:ascii="Times New Roman" w:cs="Times New Roman" w:eastAsia="Times New Roman" w:hAnsi="Times New Roman"/>
+            <w:sz w:val="22"/>
+            <w:szCs w:val="22"/>
+          </w:rPr>
+          <w:t xml:space="preserve">https://doi.org/10.1162/daed_a_00534</w:t>
+        </w:r>
+      </w:hyperlink>
     </w:p>
     <w:p>
       <w:pPr>
@@ -277,8 +296,27 @@
           <w:szCs w:val="24"/>
           <w:rtl/>
         </w:rPr>
-        <w:t xml:space="preserve">(Rabinovich-Einy &amp; Katsh, 2017) - ספר אקדמי. אותר בקטלוג הספרייה ובמאגר Oxford Academic באמצעות מילות החיפוש: "online dispute resolution" AND "access to justice".</w:t>
-      </w:r>
+        <w:t xml:space="preserve">(Katsh &amp; Rabinovich-Einy, 2017) - ספר אקדמי. אותר בקטלוג הספרייה ובמאגר Oxford Academic באמצעות מילות החיפוש: "online dispute resolution" AND "access to justice". קישור לספר:</w:t>
+      </w:r>
+    </w:p>
+    <w:p>
+      <w:pPr>
+        <w:bidi w:val="false"/>
+        <w:spacing w:after="120" w:line="360" w:lineRule="auto"/>
+        <w:ind w:left="709"/>
+        <w:jc w:val="left"/>
+      </w:pPr>
+      <w:hyperlink w:history="1" r:id="rIds-1hpvbywxf1g2fkzxgph">
+        <w:r>
+          <w:rPr>
+            <w:rStyle w:val="Hyperlink"/>
+            <w:rFonts w:ascii="Times New Roman" w:cs="Times New Roman" w:eastAsia="Times New Roman" w:hAnsi="Times New Roman"/>
+            <w:sz w:val="22"/>
+            <w:szCs w:val="22"/>
+          </w:rPr>
+          <w:t xml:space="preserve">https://global.oup.com/academic/product/digital-justice-9780190675677</w:t>
+        </w:r>
+      </w:hyperlink>
     </w:p>
     <w:p>
       <w:pPr>
@@ -295,8 +333,27 @@
           <w:szCs w:val="24"/>
           <w:rtl/>
         </w:rPr>
-        <w:t xml:space="preserve">(Chua &amp; Engel, 2019) - מאמר אקדמי מכתב עת. אותר במאגר Annual Reviews באמצעות מילות החיפוש: "legal consciousness" AND (courts OR litigants).</w:t>
-      </w:r>
+        <w:t xml:space="preserve">(אלבין, 2016) - מאמר אקדמי מכתב עת. אותר במדור כתבי העת של המאגר המשפטי נבו, בכתב העת "חוקים", באמצעות מילות החיפוש: נגישות לצדק AND סיוע משפטי. קישור למאמר:</w:t>
+      </w:r>
+    </w:p>
+    <w:p>
+      <w:pPr>
+        <w:bidi w:val="false"/>
+        <w:spacing w:after="120" w:line="360" w:lineRule="auto"/>
+        <w:ind w:left="709"/>
+        <w:jc w:val="left"/>
+      </w:pPr>
+      <w:hyperlink w:history="1" r:id="rIdc5kpjlz0bsfuwfvqma9bq">
+        <w:r>
+          <w:rPr>
+            <w:rStyle w:val="Hyperlink"/>
+            <w:rFonts w:ascii="Times New Roman" w:cs="Times New Roman" w:eastAsia="Times New Roman" w:hAnsi="Times New Roman"/>
+            <w:sz w:val="22"/>
+            <w:szCs w:val="22"/>
+          </w:rPr>
+          <w:t xml:space="preserve">https://cris.huji.ac.il/en/publications/מבוא-על-נגישות-למשפט-ונגישות-לצדק</w:t>
+        </w:r>
+      </w:hyperlink>
     </w:p>
     <w:p>
       <w:pPr>
@@ -332,7 +389,7 @@
           <w:szCs w:val="24"/>
           <w:rtl/>
         </w:rPr>
-        <w:t xml:space="preserve">ראש פרק זה עוסק בנגישות לצדק ובייצוג המשפטי הניתן מטעם המדינה למי שידם אינה משגת. נקודת המוצא היא שזכות הגישה לערכאות נותרת ריקה כאשר מימושה תלוי במשאבים שאין לתובע. הטענה המרכזית של הפרק היא שנגישות לצדק אינה מסתכמת בהעמדת עורך דין, אלא תלויה באופן שבו המוסדות עצמם בנויים ובאופן שבו בעלי הדין תופסים אותם. מן הטענה הזאת נגזר שגם מי שקיבל ייצוג ציבורי עשוי לחוות חסמים של זמן, ידע ותודעה. הפרק נשען על שלושה מקורות עדכניים הבוחנים את הנגישות משלושה כיוונים משלימים: היקף הבעיה, עיצוב המוסדות ותודעת המשתמשים. הדיון בהם יניח את התשתית לניתוח חוויית הייצוג במקרה הבוחן של העבודה.</w:t>
+        <w:t xml:space="preserve">ראש פרק זה עוסק בנגישות לצדק ובייצוג המשפטי הניתן מטעם המדינה למי שידם אינה משגת. נקודת המוצא היא שזכות הגישה לערכאות נותרת ריקה מתוכן כאשר מימושה תלוי במשאבים שאין לתובע. בשיח הציבורי מקובל לזהות את פתרון הבעיה עם עצם קיומו של ייצוג, כלומר עם מינוי עורך דין למי שאינו יכול לשלם. הטענה המרכזית של הפרק היא שנגישות לצדק אינה מסתכמת בהעמדת עורך דין, אלא תלויה באופן שבו המוסדות בנויים ובאופן שבו בעלי הדין תופסים אותם וחווים אותם. מן הטענה נגזר שגם מי שקיבל ייצוג ציבורי עשוי להיתקל בחסמים של זמן, ידע, שפה ותודעה. הפרק נשען על שלושה מקורות מן העשור האחרון, הבוחנים את הנגישות משלושה כיוונים משלימים: הגדרה מחודשת של היקף הבעיה, העיצוב המוסדי והטכנולוגי, וההמשגה הישראלית העדכנית. הדיון בהם יניח את התשתית לניתוח חוויית הייצוג מטעם המדינה במקרה הבוחן של העבודה.</w:t>
       </w:r>
     </w:p>
     <w:p>
@@ -350,7 +407,7 @@
           <w:szCs w:val="24"/>
           <w:rtl/>
         </w:rPr>
-        <w:t xml:space="preserve">סנדפור (Sandefur, 2019) בוחנת את משבר הנגישות לצדק בארצות הברית ומציעה לו אבחנה מפתיעה. לטענתה, הבעיה המרכזית אינה מחסור בעורכי דין או במימון הייצוג, כפי שנהוג להניח. מרבית האנשים המתמודדים עם בעיות בעלות אופי משפטי כלל אינם מזהים אותן ככאלה, ולכן אינם פונים לעזרה משפטית מלכתחילה. גם כאשר הם פונים, המוסדות בנויים סביב צורכיהם של אנשי המקצוע ולא סביב יכולותיהם של המשתמשים ההדיוטות. מכאן שהפתרון אינו רק תוספת של עורכי דין, אלא עיצוב מחדש של הדרכים שבהן המערכת נפגשת עם הציבור. המסקנה חשובה לענייננו: ייצוג ציבורי הוא תנאי הכרחי אך לא מספיק לנגישות ממשית לצדק.</w:t>
+        <w:t xml:space="preserve">סנדפור (Sandefur, 2019) בוחנת את משבר הנגישות לצדק בארצות הברית ומציעה לו אבחון מפתיע. לטענתה, הבעיה המרכזית אינה מחסור בעורכי דין או במימון הייצוג, כפי שנהוג להניח. מחקריה מראים שמרבית האנשים המתמודדים עם בעיות בעלות אופי משפטי, בתחומי תעסוקה, דיור וחובות, כלל אינם מזהים אותן כבעיות משפטיות. משום כך הם אינם פונים לעזרה מקצועית, והבעיות מוכרעות בפועל על ידי הצד החזק, המעסיק, בעל הבית או הנושה. גם כאשר האזרח כן מגיע למערכת, הוא מוצא מוסדות שבנויים סביב צורכיהם של אנשי המקצוע ולא סביב יכולותיו של ההדיוט. מכאן שהפתרון אינו רק תוספת של עורכי דין, אלא עיצוב מחדש של נקודות המפגש שבין הציבור למערכת. המסקנה החשובה לענייננו היא שייצוג ציבורי הוא תנאי הכרחי אך לא מספיק לנגישות ממשית לצדק.</w:t>
       </w:r>
     </w:p>
     <w:p>
@@ -368,7 +425,7 @@
           <w:szCs w:val="24"/>
           <w:rtl/>
         </w:rPr>
-        <w:t xml:space="preserve">שני המקורות הנוספים מפתחים את הכיוון הזה משני עברים שונים, המוסדי והתודעתי. רבינוביץ'-איני וקאטש (Rabinovich-Einy &amp; Katsh, 2017) מתמקדים בעיצוב המוסדי ומראים כיצד טכנולוגיות ליישוב סכסוכים מקוון עשויות להנגיש הליכים דווקא לבעלי דין קטנים, שהמערכת המסורתית יקרה ואיטית מדי עבורם. מנגד, צ'ואה ואנגל (Chua &amp; Engel, 2019) סוקרים את מחקר התודעה המשפטית ומדגישים שהנכונות לפנות למשפט תלויה באמונות, ברגשות ובניסיון קודם לא פחות מאשר בזמינותם של שירותים. המשותף לשניים הוא הסטת המבט מן השאלה מי מייצג אל השאלה כיצד המערכת נחווית. מהשוואתם עולה שהנגישות מתעצבת בשני מפגשים: בין האזרח למוסד, ובין האזרח לדימוי שיש לו על המוסד. כאשר שני המפגשים האלה מתווכים על ידי מחסור ועומס, הייצוג הציבורי נחווה כברירת מחדל ולא כזכות. כך נסגר המעגל עם טענת הפרק: הנגישות היא תוצר של מבנה ושל תודעה גם יחד.</w:t>
+        <w:t xml:space="preserve">שני המקורות הנוספים מפתחים את הכיוון הזה משני עברים, הטכנולוגי-מוסדי והמושגי-ישראלי. קאטש ורבינוביץ'-איני (Katsh &amp; Rabinovich-Einy, 2017) מתמקדים בעיצוב המוסדי ומראים כיצד מערכות מקוונות ליישוב סכסוכים יכולות להנגיש הליכים דווקא לבעלי דין קטנים, שההליך המסורתי יקר, איטי ומרתיע מדי עבורם. לשיטתם, הנגישות נמדדת בסופו של דבר בשאלה כמה קל למשתמש רגיל להתחיל הליך, להבין אותו ולסיים אותו. אלבין (2016) מציעה את התשתית המושגית לדיון הישראלי ומבחינה בין נגישות למשפט, כלומר לערכאות ולהליכים, ובין נגישות לצדק, כלומר לתוצאה הוגנת בפועל. לדבריה, השנים האחרונות הרחיבו את הדיון מן השאלה מי מקבל ייצוג אל השאלה אילו חסמים מבניים מונעים צדק מהותי מאוכלוסיות מוחלשות. חיבור שני המקורות מלמד שהנגישות מוכרעת בשני מפגשים: בין האזרח למוסד, ובין האזרח למושג הצדק שהוא נושא עימו. כאשר המפגשים האלה מתווכים על ידי מחסור ועומס, הייצוג הציבורי נחווה כברירת מחדל ולא כזכות.</w:t>
       </w:r>
     </w:p>
     <w:p>
@@ -386,7 +443,7 @@
           <w:szCs w:val="24"/>
           <w:rtl/>
         </w:rPr>
-        <w:t xml:space="preserve">השורה התחתונה של ראש הפרק היא שנגישות לצדק צריכה להימדד בחוויית המשתמש, ולא רק בקיומו של ייצוג. שלושת המקורות מצביעים יחד על פער בין הזכות הפורמלית לבין מימושה בפועל. הפער הזה אינו נסגר ברגע שממונה עורך דין מטעם המדינה, והוא מלווה את בעל הדין לכל אורך ההליך. מסקנה זו מובילה ישירות לראש הפרק הבא בסקירת הספרות, שיעסוק במה שמתרחש אחרי ההכרעה השיפוטית. שם ייבחן הפער שבין פסק הדין הכתוב לבין אכיפתו בפועל, המקום שבו הנגישות לצדק עומדת במבחנה האחרון.</w:t>
+        <w:t xml:space="preserve">השורה התחתונה של ראש הפרק היא שנגישות לצדק צריכה להימדד בחוויית המשתמש ובתוצאה, ולא רק בקיומו הפורמלי של ייצוג. שלושת המקורות מצביעים יחד על פער עקבי בין הזכות הכתובה לבין מימושה בפועל. הפער אינו נסגר ברגע שממונה עורך דין מטעם המדינה, והוא מלווה את בעל הדין לאורך ההליך כולו. חשוב מכך, הוא אינו מסתיים גם בפסק הדין, שכן גם זכייה כתובה עדיין צריכה להיאכף. מסקנה זו מובילה ישירות לראש הפרק הבא בסקירת הספרות, שיעסוק בפער שבין החוק שבספרים לחוק שבפעולה. שם ייבחן השלב שבו הנגישות לצדק עומדת במבחנה האחרון: גביית פסק הדין הלכה למעשה.</w:t>
       </w:r>
     </w:p>
     <w:p>
@@ -408,6 +465,67 @@
         </w:rPr>
         <w:t xml:space="preserve">רשימת מקורות</w:t>
       </w:r>
+    </w:p>
+    <w:p>
+      <w:pPr>
+        <w:bidi/>
+        <w:spacing w:after="180" w:line="360" w:lineRule="auto"/>
+        <w:ind w:left="709" w:hanging="709"/>
+        <w:jc w:val="start"/>
+      </w:pPr>
+      <w:r>
+        <w:rPr>
+          <w:rFonts w:ascii="Times New Roman" w:cs="David" w:eastAsia="David" w:hAnsi="Times New Roman"/>
+          <w:b w:val="false"/>
+          <w:i w:val="false"/>
+          <w:sz w:val="24"/>
+          <w:szCs w:val="24"/>
+          <w:rtl/>
+        </w:rPr>
+        <w:t xml:space="preserve">אלבין, ע' (2016). מבוא: על נגישות למשפט ונגישות לצדק. </w:t>
+      </w:r>
+      <w:r>
+        <w:rPr>
+          <w:rFonts w:ascii="Times New Roman" w:cs="David" w:eastAsia="David" w:hAnsi="Times New Roman"/>
+          <w:b w:val="false"/>
+          <w:i/>
+          <w:iCs/>
+          <w:sz w:val="24"/>
+          <w:szCs w:val="24"/>
+          <w:rtl/>
+        </w:rPr>
+        <w:t xml:space="preserve">חוקים, ח</w:t>
+      </w:r>
+      <w:r>
+        <w:rPr>
+          <w:rFonts w:ascii="Times New Roman" w:cs="David" w:eastAsia="David" w:hAnsi="Times New Roman"/>
+          <w:b w:val="false"/>
+          <w:i w:val="false"/>
+          <w:sz w:val="24"/>
+          <w:szCs w:val="24"/>
+          <w:rtl/>
+        </w:rPr>
+        <w:t xml:space="preserve">, 5-14. זמין במאגר המשפטי נבו.</w:t>
+      </w:r>
+    </w:p>
+    <w:p>
+      <w:pPr>
+        <w:bidi w:val="false"/>
+        <w:spacing w:after="180" w:line="360" w:lineRule="auto"/>
+        <w:ind w:left="709"/>
+        <w:jc w:val="left"/>
+      </w:pPr>
+      <w:hyperlink w:history="1" r:id="rIdlzwu7rkyke6zmucc0k4rg">
+        <w:r>
+          <w:rPr>
+            <w:rStyle w:val="Hyperlink"/>
+            <w:rFonts w:ascii="Times New Roman" w:cs="Times New Roman" w:eastAsia="Times New Roman" w:hAnsi="Times New Roman"/>
+            <w:sz w:val="22"/>
+            <w:szCs w:val="22"/>
+          </w:rPr>
+          <w:t xml:space="preserve">https://cris.huji.ac.il/en/publications/מבוא-על-נגישות-למשפט-ונגישות-לצדק</w:t>
+        </w:r>
+      </w:hyperlink>
     </w:p>
     <w:p>
       <w:pPr>
@@ -425,7 +543,7 @@
           <w:szCs w:val="24"/>
           <w:rtl w:val="false"/>
         </w:rPr>
-        <w:t xml:space="preserve">Chua, L. J., &amp; Engel, D. M. (2019). Legal consciousness reconsidered. </w:t>
+        <w:t xml:space="preserve">Katsh, E., &amp; Rabinovich-Einy, O. (2017). </w:t>
       </w:r>
       <w:r>
         <w:rPr>
@@ -437,7 +555,7 @@
           <w:szCs w:val="24"/>
           <w:rtl w:val="false"/>
         </w:rPr>
-        <w:t xml:space="preserve">Annual Review of Law and Social Science, 15</w:t>
+        <w:t xml:space="preserve">Digital justice: Technology and the internet of disputes</w:t>
       </w:r>
       <w:r>
         <w:rPr>
@@ -448,8 +566,27 @@
           <w:szCs w:val="24"/>
           <w:rtl w:val="false"/>
         </w:rPr>
-        <w:t xml:space="preserve">, 335-353.</w:t>
-      </w:r>
+        <w:t xml:space="preserve">. Oxford University Press.</w:t>
+      </w:r>
+    </w:p>
+    <w:p>
+      <w:pPr>
+        <w:bidi w:val="false"/>
+        <w:spacing w:after="180" w:line="360" w:lineRule="auto"/>
+        <w:ind w:left="709"/>
+        <w:jc w:val="left"/>
+      </w:pPr>
+      <w:hyperlink w:history="1" r:id="rIdua0xeyqnswev90s9xscoe">
+        <w:r>
+          <w:rPr>
+            <w:rStyle w:val="Hyperlink"/>
+            <w:rFonts w:ascii="Times New Roman" w:cs="Times New Roman" w:eastAsia="Times New Roman" w:hAnsi="Times New Roman"/>
+            <w:sz w:val="22"/>
+            <w:szCs w:val="22"/>
+          </w:rPr>
+          <w:t xml:space="preserve">https://global.oup.com/academic/product/digital-justice-9780190675677</w:t>
+        </w:r>
+      </w:hyperlink>
     </w:p>
     <w:p>
       <w:pPr>
@@ -467,7 +604,7 @@
           <w:szCs w:val="24"/>
           <w:rtl w:val="false"/>
         </w:rPr>
-        <w:t xml:space="preserve">Rabinovich-Einy, O., &amp; Katsh, E. (2017). </w:t>
+        <w:t xml:space="preserve">Sandefur, R. L. (2019). Access to what? </w:t>
       </w:r>
       <w:r>
         <w:rPr>
@@ -479,7 +616,7 @@
           <w:szCs w:val="24"/>
           <w:rtl w:val="false"/>
         </w:rPr>
-        <w:t xml:space="preserve">Digital justice: Technology and the internet of disputes</w:t>
+        <w:t xml:space="preserve">Daedalus, 148</w:t>
       </w:r>
       <w:r>
         <w:rPr>
@@ -490,50 +627,27 @@
           <w:szCs w:val="24"/>
           <w:rtl w:val="false"/>
         </w:rPr>
-        <w:t xml:space="preserve">. Oxford University Press.</w:t>
+        <w:t xml:space="preserve">(1), 49-55.</w:t>
       </w:r>
     </w:p>
     <w:p>
       <w:pPr>
         <w:bidi w:val="false"/>
         <w:spacing w:after="180" w:line="360" w:lineRule="auto"/>
-        <w:ind w:left="709" w:hanging="709"/>
+        <w:ind w:left="709"/>
         <w:jc w:val="left"/>
       </w:pPr>
-      <w:r>
-        <w:rPr>
-          <w:rFonts w:ascii="Times New Roman" w:cs="Times New Roman" w:eastAsia="Times New Roman" w:hAnsi="Times New Roman"/>
-          <w:b w:val="false"/>
-          <w:i w:val="false"/>
-          <w:sz w:val="24"/>
-          <w:szCs w:val="24"/>
-          <w:rtl w:val="false"/>
-        </w:rPr>
-        <w:t xml:space="preserve">Sandefur, R. L. (2019). Access to what? </w:t>
-      </w:r>
-      <w:r>
-        <w:rPr>
-          <w:rFonts w:ascii="Times New Roman" w:cs="Times New Roman" w:eastAsia="Times New Roman" w:hAnsi="Times New Roman"/>
-          <w:b w:val="false"/>
-          <w:i/>
-          <w:iCs/>
-          <w:sz w:val="24"/>
-          <w:szCs w:val="24"/>
-          <w:rtl w:val="false"/>
-        </w:rPr>
-        <w:t xml:space="preserve">Daedalus, 148</w:t>
-      </w:r>
-      <w:r>
-        <w:rPr>
-          <w:rFonts w:ascii="Times New Roman" w:cs="Times New Roman" w:eastAsia="Times New Roman" w:hAnsi="Times New Roman"/>
-          <w:b w:val="false"/>
-          <w:i w:val="false"/>
-          <w:sz w:val="24"/>
-          <w:szCs w:val="24"/>
-          <w:rtl w:val="false"/>
-        </w:rPr>
-        <w:t xml:space="preserve">(1), 49-55.</w:t>
-      </w:r>
+      <w:hyperlink w:history="1" r:id="rIdps_angfrowfyagvhsb7pt">
+        <w:r>
+          <w:rPr>
+            <w:rStyle w:val="Hyperlink"/>
+            <w:rFonts w:ascii="Times New Roman" w:cs="Times New Roman" w:eastAsia="Times New Roman" w:hAnsi="Times New Roman"/>
+            <w:sz w:val="22"/>
+            <w:szCs w:val="22"/>
+          </w:rPr>
+          <w:t xml:space="preserve">https://doi.org/10.1162/daed_a_00534</w:t>
+        </w:r>
+      </w:hyperlink>
     </w:p>
     <w:sectPr>
       <w:headerReference w:type="default" r:id="rId7"/>

</xml_diff>

<commit_message>
Regenerate Hadar's summative assignment with the enriched chapter head
The previous commit missed this file because the generation step was
skipped after a script error; the document now matches the enriched
source with the fuller anchor and closing paragraphs.

Co-Authored-By: Claude Fable 5 <noreply@anthropic.com>
Claude-Session: https://claude.ai/code/session_01JBE53LuiqYDoXy9kPJLxew
</commit_message>
<xml_diff>
--- a/seminar-papers/עבודה מסכמת - קריאה וכתיבה אקדמית ב - הדר פוקס.docx
+++ b/seminar-papers/עבודה מסכמת - קריאה וכתיבה אקדמית ב - הדר פוקס.docx
@@ -269,7 +269,7 @@
         <w:ind w:left="709"/>
         <w:jc w:val="left"/>
       </w:pPr>
-      <w:hyperlink w:history="1" r:id="rIdphkzk54e1yqfxkhl0pn-9">
+      <w:hyperlink w:history="1" r:id="rIdsmhxidhfiuiehcyumb8uh">
         <w:r>
           <w:rPr>
             <w:rStyle w:val="Hyperlink"/>
@@ -306,7 +306,7 @@
         <w:ind w:left="709"/>
         <w:jc w:val="left"/>
       </w:pPr>
-      <w:hyperlink w:history="1" r:id="rIds-1hpvbywxf1g2fkzxgph">
+      <w:hyperlink w:history="1" r:id="rIdx44zmh-ik5y_t83nxfsvx">
         <w:r>
           <w:rPr>
             <w:rStyle w:val="Hyperlink"/>
@@ -343,7 +343,7 @@
         <w:ind w:left="709"/>
         <w:jc w:val="left"/>
       </w:pPr>
-      <w:hyperlink w:history="1" r:id="rIdc5kpjlz0bsfuwfvqma9bq">
+      <w:hyperlink w:history="1" r:id="rIdxq8kytubjqpjslc2asfqh">
         <w:r>
           <w:rPr>
             <w:rStyle w:val="Hyperlink"/>
@@ -389,7 +389,7 @@
           <w:szCs w:val="24"/>
           <w:rtl/>
         </w:rPr>
-        <w:t xml:space="preserve">ראש פרק זה עוסק בנגישות לצדק ובייצוג המשפטי הניתן מטעם המדינה למי שידם אינה משגת. נקודת המוצא היא שזכות הגישה לערכאות נותרת ריקה מתוכן כאשר מימושה תלוי במשאבים שאין לתובע. בשיח הציבורי מקובל לזהות את פתרון הבעיה עם עצם קיומו של ייצוג, כלומר עם מינוי עורך דין למי שאינו יכול לשלם. הטענה המרכזית של הפרק היא שנגישות לצדק אינה מסתכמת בהעמדת עורך דין, אלא תלויה באופן שבו המוסדות בנויים ובאופן שבו בעלי הדין תופסים אותם וחווים אותם. מן הטענה נגזר שגם מי שקיבל ייצוג ציבורי עשוי להיתקל בחסמים של זמן, ידע, שפה ותודעה. הפרק נשען על שלושה מקורות מן העשור האחרון, הבוחנים את הנגישות משלושה כיוונים משלימים: הגדרה מחודשת של היקף הבעיה, העיצוב המוסדי והטכנולוגי, וההמשגה הישראלית העדכנית. הדיון בהם יניח את התשתית לניתוח חוויית הייצוג מטעם המדינה במקרה הבוחן של העבודה.</w:t>
+        <w:t xml:space="preserve">ראש פרק זה, הראשון בסקירת הספרות של עבודת הסמינריון, עוסק בנגישות לצדק ובייצוג המשפטי הניתן מטעם המדינה למי שידם אינה משגת. נקודת המוצא היא שזכות הגישה לערכאות נותרת ריקה מתוכן כאשר מימושה בפועל תלוי במשאבים, בידע ובזמן שאין לתובע מן השורה. בשיח הציבורי מקובל לזהות את פתרון הבעיה עם עצם קיומו של ייצוג, כלומר עם מינוי עורך דין מטעם הסיוע המשפטי למי שאינו יכול לשלם, וכך נמדדת בדרך כלל גם הצלחתה של מדיניות הרווחה המשפטית. הטענה המרכזית של ראש הפרק היא שנגישות לצדק אינה מסתכמת בהעמדת עורך דין, אלא תלויה באופן שבו המוסדות בנויים, בשפה שבה הם מדברים, ובאופן שבו בעלי הדין תופסים אותם וחווים אותם לאורך ההליך. מן הטענה נגזרת השערה מעשית: גם מי שקיבל ייצוג ציבורי מלא עשוי להיתקל בחסמים של זמן, ידע, שפה ותודעה, ולחוות את ההליך כזירה זרה שאינה ערוכה סביבו. לביסוס הטענה נשען הפרק על שלושה מקורות מן העשור האחרון, הבוחנים את הנגישות משלושה כיוונים משלימים: הגדרה מחודשת של היקף הבעיה ושורשיה, העיצוב המוסדי והטכנולוגי של מערכות יישוב סכסוכים, וההמשגה הישראלית העדכנית של המושג. הדיון המשולב בשלושתם יניח את התשתית לניתוח חוויית הייצוג מטעם המדינה במקרה הבוחן האישי שבלב העבודה.</w:t>
       </w:r>
     </w:p>
     <w:p>
@@ -443,7 +443,7 @@
           <w:szCs w:val="24"/>
           <w:rtl/>
         </w:rPr>
-        <w:t xml:space="preserve">השורה התחתונה של ראש הפרק היא שנגישות לצדק צריכה להימדד בחוויית המשתמש ובתוצאה, ולא רק בקיומו הפורמלי של ייצוג. שלושת המקורות מצביעים יחד על פער עקבי בין הזכות הכתובה לבין מימושה בפועל. הפער אינו נסגר ברגע שממונה עורך דין מטעם המדינה, והוא מלווה את בעל הדין לאורך ההליך כולו. חשוב מכך, הוא אינו מסתיים גם בפסק הדין, שכן גם זכייה כתובה עדיין צריכה להיאכף. מסקנה זו מובילה ישירות לראש הפרק הבא בסקירת הספרות, שיעסוק בפער שבין החוק שבספרים לחוק שבפעולה. שם ייבחן השלב שבו הנגישות לצדק עומדת במבחנה האחרון: גביית פסק הדין הלכה למעשה.</w:t>
+        <w:t xml:space="preserve">השורה התחתונה של ראש הפרק היא שנגישות לצדק צריכה להימדד בחוויית המשתמש ובתוצאה המעשית, ולא רק בקיומו הפורמלי של ייצוג. שלושת המקורות, כל אחד מזווית אחרת, מצביעים יחד על פער עקבי בין הזכות הכתובה לבין מימושה בפועל, פער שמתרכז דווקא אצל האוכלוסיות התלויות בייצוג הציבורי. הפער אינו נסגר ברגע שממונה עורך דין מטעם המדינה, והוא מלווה את בעל הדין בכל תחנה של ההליך, מהגשת התביעה ועד ההכרעה. חשוב מכך, הוא אינו מסתיים גם בפסק הדין עצמו, שכן זכייה כתובה שאינה נאכפת נותרת הבטחה על נייר. מסקנה זו מובילה ישירות לראש הפרק הבא בסקירת הספרות, שיעסוק בפער שבין החוק שבספרים לחוק שבפעולה לאור תופעת האקטיביזם המשפטי בישראל. שם ייבחן השלב שבו הנגישות לצדק עומדת במבחנה האחרון והקשה ביותר: גביית פסק הדין הלכה למעשה.</w:t>
       </w:r>
     </w:p>
     <w:p>
@@ -515,7 +515,7 @@
         <w:ind w:left="709"/>
         <w:jc w:val="left"/>
       </w:pPr>
-      <w:hyperlink w:history="1" r:id="rIdlzwu7rkyke6zmucc0k4rg">
+      <w:hyperlink w:history="1" r:id="rIdn1azuyvc1jksokylaxxz8">
         <w:r>
           <w:rPr>
             <w:rStyle w:val="Hyperlink"/>
@@ -576,7 +576,7 @@
         <w:ind w:left="709"/>
         <w:jc w:val="left"/>
       </w:pPr>
-      <w:hyperlink w:history="1" r:id="rIdua0xeyqnswev90s9xscoe">
+      <w:hyperlink w:history="1" r:id="rIdjhgpfgotqj4vh8higaa2b">
         <w:r>
           <w:rPr>
             <w:rStyle w:val="Hyperlink"/>
@@ -637,7 +637,7 @@
         <w:ind w:left="709"/>
         <w:jc w:val="left"/>
       </w:pPr>
-      <w:hyperlink w:history="1" r:id="rIdps_angfrowfyagvhsb7pt">
+      <w:hyperlink w:history="1" r:id="rId9oeepqhjasvnd5alohbcd">
         <w:r>
           <w:rPr>
             <w:rStyle w:val="Hyperlink"/>

</xml_diff>

<commit_message>
Replace paywalled books with fully open-access sources in both assignments
All three items in each assignment now have free full-text access:
Sandefur 2019 (open PDF), Sela 2016 (Cornell repository) and Albin 2016
(Nevo PDF) for one submission; Chua & Engel 2019 (Buffalo repository),
Peleg 2022 (Media Frames open journal) and Nadiv 2022 (Reichman
repository) for the other. Chapter-head paragraphs and reference lists
updated accordingly.

Co-Authored-By: Claude Fable 5 <noreply@anthropic.com>
Claude-Session: https://claude.ai/code/session_01JBE53LuiqYDoXy9kPJLxew
</commit_message>
<xml_diff>
--- a/seminar-papers/עבודה מסכמת - קריאה וכתיבה אקדמית ב - הדר פוקס.docx
+++ b/seminar-papers/עבודה מסכמת - קריאה וכתיבה אקדמית ב - הדר פוקס.docx
@@ -259,7 +259,7 @@
           <w:szCs w:val="24"/>
           <w:rtl/>
         </w:rPr>
-        <w:t xml:space="preserve">(Sandefur, 2019) - מאמר אקדמי מכתב עת. אותר במנוע החיפוש Google Scholar באמצעות מילות החיפוש והאופרטורים: "access to justice" AND "legal aid" AND inequality. קישור למאמר:</w:t>
+        <w:t xml:space="preserve">(Sandefur, 2019) - מאמר אקדמי מכתב עת. אותר במנוע החיפוש Google Scholar באמצעות מילות החיפוש והאופרטורים: "access to justice" AND "legal aid" AND inequality. קישור לטקסט המלא:</w:t>
       </w:r>
     </w:p>
     <w:p>
@@ -269,7 +269,7 @@
         <w:ind w:left="709"/>
         <w:jc w:val="left"/>
       </w:pPr>
-      <w:hyperlink w:history="1" r:id="rIdsmhxidhfiuiehcyumb8uh">
+      <w:hyperlink w:history="1" r:id="rIdacx7sts6hxjlamhed4pir">
         <w:r>
           <w:rPr>
             <w:rStyle w:val="Hyperlink"/>
@@ -277,7 +277,7 @@
             <w:sz w:val="22"/>
             <w:szCs w:val="22"/>
           </w:rPr>
-          <w:t xml:space="preserve">https://doi.org/10.1162/daed_a_00534</w:t>
+          <w:t xml:space="preserve">https://www.amacad.org/sites/default/files/publication/downloads/19_Winter_Daedalus_Sandefur.pdf</w:t>
         </w:r>
       </w:hyperlink>
     </w:p>
@@ -296,7 +296,7 @@
           <w:szCs w:val="24"/>
           <w:rtl/>
         </w:rPr>
-        <w:t xml:space="preserve">(Katsh &amp; Rabinovich-Einy, 2017) - ספר אקדמי. אותר בקטלוג הספרייה ובמאגר Oxford Academic באמצעות מילות החיפוש: "online dispute resolution" AND "access to justice". קישור לספר:</w:t>
+        <w:t xml:space="preserve">(Sela, 2016) - מאמר אקדמי מכתב עת. אותר במנוע החיפוש Google Scholar באמצעות מילות החיפוש והאופרטורים: "online courts" AND "self-represented litigants". קישור לטקסט המלא:</w:t>
       </w:r>
     </w:p>
     <w:p>
@@ -306,7 +306,7 @@
         <w:ind w:left="709"/>
         <w:jc w:val="left"/>
       </w:pPr>
-      <w:hyperlink w:history="1" r:id="rIdx44zmh-ik5y_t83nxfsvx">
+      <w:hyperlink w:history="1" r:id="rIdatkfdc_ldety6o1avnrxs">
         <w:r>
           <w:rPr>
             <w:rStyle w:val="Hyperlink"/>
@@ -314,7 +314,7 @@
             <w:sz w:val="22"/>
             <w:szCs w:val="22"/>
           </w:rPr>
-          <w:t xml:space="preserve">https://global.oup.com/academic/product/digital-justice-9780190675677</w:t>
+          <w:t xml:space="preserve">https://scholarship.law.cornell.edu/cjlpp/vol26/iss2/3/</w:t>
         </w:r>
       </w:hyperlink>
     </w:p>
@@ -333,7 +333,7 @@
           <w:szCs w:val="24"/>
           <w:rtl/>
         </w:rPr>
-        <w:t xml:space="preserve">(אלבין, 2016) - מאמר אקדמי מכתב עת. אותר במדור כתבי העת של המאגר המשפטי נבו, בכתב העת "חוקים", באמצעות מילות החיפוש: נגישות לצדק AND סיוע משפטי. קישור למאמר:</w:t>
+        <w:t xml:space="preserve">(אלבין, 2016) - מאמר אקדמי מכתב עת. אותר במדור כתבי העת של המאגר המשפטי נבו, בכתב העת "חוקים", באמצעות מילות החיפוש: נגישות לצדק AND סיוע משפטי. קישור לטקסט המלא בנבו:</w:t>
       </w:r>
     </w:p>
     <w:p>
@@ -343,7 +343,7 @@
         <w:ind w:left="709"/>
         <w:jc w:val="left"/>
       </w:pPr>
-      <w:hyperlink w:history="1" r:id="rIdxq8kytubjqpjslc2asfqh">
+      <w:hyperlink w:history="1" r:id="rIdxmoutgsnv4zp6i9zrmwou">
         <w:r>
           <w:rPr>
             <w:rStyle w:val="Hyperlink"/>
@@ -351,7 +351,7 @@
             <w:sz w:val="22"/>
             <w:szCs w:val="22"/>
           </w:rPr>
-          <w:t xml:space="preserve">https://cris.huji.ac.il/en/publications/מבוא-על-נגישות-למשפט-ונגישות-לצדק</w:t>
+          <w:t xml:space="preserve">https://www.nevo.co.il/books/כתבי עת/כתבי עת/חוקים/גליון ח/hukim-08-005.pdf</w:t>
         </w:r>
       </w:hyperlink>
     </w:p>
@@ -425,7 +425,7 @@
           <w:szCs w:val="24"/>
           <w:rtl/>
         </w:rPr>
-        <w:t xml:space="preserve">שני המקורות הנוספים מפתחים את הכיוון הזה משני עברים, הטכנולוגי-מוסדי והמושגי-ישראלי. קאטש ורבינוביץ'-איני (Katsh &amp; Rabinovich-Einy, 2017) מתמקדים בעיצוב המוסדי ומראים כיצד מערכות מקוונות ליישוב סכסוכים יכולות להנגיש הליכים דווקא לבעלי דין קטנים, שההליך המסורתי יקר, איטי ומרתיע מדי עבורם. לשיטתם, הנגישות נמדדת בסופו של דבר בשאלה כמה קל למשתמש רגיל להתחיל הליך, להבין אותו ולסיים אותו. אלבין (2016) מציעה את התשתית המושגית לדיון הישראלי ומבחינה בין נגישות למשפט, כלומר לערכאות ולהליכים, ובין נגישות לצדק, כלומר לתוצאה הוגנת בפועל. לדבריה, השנים האחרונות הרחיבו את הדיון מן השאלה מי מקבל ייצוג אל השאלה אילו חסמים מבניים מונעים צדק מהותי מאוכלוסיות מוחלשות. חיבור שני המקורות מלמד שהנגישות מוכרעת בשני מפגשים: בין האזרח למוסד, ובין האזרח למושג הצדק שהוא נושא עימו. כאשר המפגשים האלה מתווכים על ידי מחסור ועומס, הייצוג הציבורי נחווה כברירת מחדל ולא כזכות.</w:t>
+        <w:t xml:space="preserve">שני המקורות הנוספים מפתחים את הכיוון הזה משני עברים, הטכנולוגי-מוסדי והמושגי-ישראלי. סלע (Sela, 2016) מתמקדת בעיצוב המוסדי ומראה כיצד בתי משפט מקוונים יכולים לתת מענה לקשייהם של מתדיינים המייצגים את עצמם, אלה שההליך המסורתי יקר, מסורבל ומרתיע מדי עבורם. ממחקרה עולה שעיצוב נכון של סביבת ההתדיינות משפר את חוויית ההליך ההוגן של בעלי דין לא מיוצגים, כלומר שהנגישות תלויה במבנה הממשק שבין האזרח למערכת. אלבין (2016) מציעה את התשתית המושגית לדיון הישראלי ומבחינה בין נגישות למשפט, כלומר לערכאות ולהליכים, ובין נגישות לצדק, כלומר לתוצאה הוגנת בפועל. לדבריה, השנים האחרונות הרחיבו את הדיון מן השאלה מי מקבל ייצוג אל השאלה אילו חסמים מבניים מונעים צדק מהותי מאוכלוסיות מוחלשות. חיבור שני המקורות מלמד שהנגישות מוכרעת בשני מפגשים: בין האזרח למוסד, ובין האזרח למושג הצדק שהוא נושא עימו. כאשר המפגשים האלה מתווכים על ידי מחסור ועומס, הייצוג הציבורי נחווה כברירת מחדל ולא כזכות.</w:t>
       </w:r>
     </w:p>
     <w:p>
@@ -515,7 +515,7 @@
         <w:ind w:left="709"/>
         <w:jc w:val="left"/>
       </w:pPr>
-      <w:hyperlink w:history="1" r:id="rIdn1azuyvc1jksokylaxxz8">
+      <w:hyperlink w:history="1" r:id="rIdbhwkdu1pnajbaif-nkesy">
         <w:r>
           <w:rPr>
             <w:rStyle w:val="Hyperlink"/>
@@ -523,7 +523,7 @@
             <w:sz w:val="22"/>
             <w:szCs w:val="22"/>
           </w:rPr>
-          <w:t xml:space="preserve">https://cris.huji.ac.il/en/publications/מבוא-על-נגישות-למשפט-ונגישות-לצדק</w:t>
+          <w:t xml:space="preserve">https://www.nevo.co.il/books/כתבי עת/כתבי עת/חוקים/גליון ח/hukim-08-005.pdf</w:t>
         </w:r>
       </w:hyperlink>
     </w:p>
@@ -543,7 +543,7 @@
           <w:szCs w:val="24"/>
           <w:rtl w:val="false"/>
         </w:rPr>
-        <w:t xml:space="preserve">Katsh, E., &amp; Rabinovich-Einy, O. (2017). </w:t>
+        <w:t xml:space="preserve">Sela, A. (2016). Streamlining justice: How online courts can resolve the challenges of pro se litigation. </w:t>
       </w:r>
       <w:r>
         <w:rPr>
@@ -555,7 +555,7 @@
           <w:szCs w:val="24"/>
           <w:rtl w:val="false"/>
         </w:rPr>
-        <w:t xml:space="preserve">Digital justice: Technology and the internet of disputes</w:t>
+        <w:t xml:space="preserve">Cornell Journal of Law and Public Policy, 26</w:t>
       </w:r>
       <w:r>
         <w:rPr>
@@ -566,7 +566,7 @@
           <w:szCs w:val="24"/>
           <w:rtl w:val="false"/>
         </w:rPr>
-        <w:t xml:space="preserve">. Oxford University Press.</w:t>
+        <w:t xml:space="preserve">(2), 331.</w:t>
       </w:r>
     </w:p>
     <w:p>
@@ -576,7 +576,7 @@
         <w:ind w:left="709"/>
         <w:jc w:val="left"/>
       </w:pPr>
-      <w:hyperlink w:history="1" r:id="rIdjhgpfgotqj4vh8higaa2b">
+      <w:hyperlink w:history="1" r:id="rIdlolmto8wsblntkkyqjerl">
         <w:r>
           <w:rPr>
             <w:rStyle w:val="Hyperlink"/>
@@ -584,7 +584,7 @@
             <w:sz w:val="22"/>
             <w:szCs w:val="22"/>
           </w:rPr>
-          <w:t xml:space="preserve">https://global.oup.com/academic/product/digital-justice-9780190675677</w:t>
+          <w:t xml:space="preserve">https://scholarship.law.cornell.edu/cjlpp/vol26/iss2/3/</w:t>
         </w:r>
       </w:hyperlink>
     </w:p>
@@ -637,7 +637,7 @@
         <w:ind w:left="709"/>
         <w:jc w:val="left"/>
       </w:pPr>
-      <w:hyperlink w:history="1" r:id="rId9oeepqhjasvnd5alohbcd">
+      <w:hyperlink w:history="1" r:id="rIdofcxyx9od1b_qzaauimq1">
         <w:r>
           <w:rPr>
             <w:rStyle w:val="Hyperlink"/>

</xml_diff>

<commit_message>
Replace Albin source with Mor 2016 after broken Nevo link report
The guessed Nevo PDF path for Albin 2016 was not reachable, so the
Hebrew item in Hadar's assignment is now Mor 2016 from the same Hukim
volume, which has a working open full-text PDF hosted by the University
of Haifa law faculty. The thematic paragraph and reference list were
updated to match.

Co-Authored-By: Claude Fable 5 <noreply@anthropic.com>
Claude-Session: https://claude.ai/code/session_01JBE53LuiqYDoXy9kPJLxew
</commit_message>
<xml_diff>
--- a/seminar-papers/עבודה מסכמת - קריאה וכתיבה אקדמית ב - הדר פוקס.docx
+++ b/seminar-papers/עבודה מסכמת - קריאה וכתיבה אקדמית ב - הדר פוקס.docx
@@ -269,7 +269,7 @@
         <w:ind w:left="709"/>
         <w:jc w:val="left"/>
       </w:pPr>
-      <w:hyperlink w:history="1" r:id="rIdacx7sts6hxjlamhed4pir">
+      <w:hyperlink w:history="1" r:id="rIdutpxgzhhsf5cohawiwxzb">
         <w:r>
           <w:rPr>
             <w:rStyle w:val="Hyperlink"/>
@@ -306,7 +306,7 @@
         <w:ind w:left="709"/>
         <w:jc w:val="left"/>
       </w:pPr>
-      <w:hyperlink w:history="1" r:id="rIdatkfdc_ldety6o1avnrxs">
+      <w:hyperlink w:history="1" r:id="rIddfpwt12v-2l8r_3qhtzpv">
         <w:r>
           <w:rPr>
             <w:rStyle w:val="Hyperlink"/>
@@ -333,7 +333,7 @@
           <w:szCs w:val="24"/>
           <w:rtl/>
         </w:rPr>
-        <w:t xml:space="preserve">(אלבין, 2016) - מאמר אקדמי מכתב עת. אותר במדור כתבי העת של המאגר המשפטי נבו, בכתב העת "חוקים", באמצעות מילות החיפוש: נגישות לצדק AND סיוע משפטי. קישור לטקסט המלא בנבו:</w:t>
+        <w:t xml:space="preserve">(מור, 2016) - מאמר אקדמי מכתב עת. אותר במדור כתבי העת של המאגר המשפטי נבו, בכתב העת "חוקים", באמצעות מילות החיפוש: נגישות לצדק AND נגישות למשפט. קישור לטקסט המלא:</w:t>
       </w:r>
     </w:p>
     <w:p>
@@ -343,7 +343,7 @@
         <w:ind w:left="709"/>
         <w:jc w:val="left"/>
       </w:pPr>
-      <w:hyperlink w:history="1" r:id="rIdxmoutgsnv4zp6i9zrmwou">
+      <w:hyperlink w:history="1" r:id="rIdag9akm_cosafppev-2t3w">
         <w:r>
           <w:rPr>
             <w:rStyle w:val="Hyperlink"/>
@@ -351,7 +351,7 @@
             <w:sz w:val="22"/>
             <w:szCs w:val="22"/>
           </w:rPr>
-          <w:t xml:space="preserve">https://www.nevo.co.il/books/כתבי עת/כתבי עת/חוקים/גליון ח/hukim-08-005.pdf</w:t>
+          <w:t xml:space="preserve">https://law.haifa.ac.il/images/documents/Trial_Accessible%20to%20all.pdf</w:t>
         </w:r>
       </w:hyperlink>
     </w:p>
@@ -425,7 +425,7 @@
           <w:szCs w:val="24"/>
           <w:rtl/>
         </w:rPr>
-        <w:t xml:space="preserve">שני המקורות הנוספים מפתחים את הכיוון הזה משני עברים, הטכנולוגי-מוסדי והמושגי-ישראלי. סלע (Sela, 2016) מתמקדת בעיצוב המוסדי ומראה כיצד בתי משפט מקוונים יכולים לתת מענה לקשייהם של מתדיינים המייצגים את עצמם, אלה שההליך המסורתי יקר, מסורבל ומרתיע מדי עבורם. ממחקרה עולה שעיצוב נכון של סביבת ההתדיינות משפר את חוויית ההליך ההוגן של בעלי דין לא מיוצגים, כלומר שהנגישות תלויה במבנה הממשק שבין האזרח למערכת. אלבין (2016) מציעה את התשתית המושגית לדיון הישראלי ומבחינה בין נגישות למשפט, כלומר לערכאות ולהליכים, ובין נגישות לצדק, כלומר לתוצאה הוגנת בפועל. לדבריה, השנים האחרונות הרחיבו את הדיון מן השאלה מי מקבל ייצוג אל השאלה אילו חסמים מבניים מונעים צדק מהותי מאוכלוסיות מוחלשות. חיבור שני המקורות מלמד שהנגישות מוכרעת בשני מפגשים: בין האזרח למוסד, ובין האזרח למושג הצדק שהוא נושא עימו. כאשר המפגשים האלה מתווכים על ידי מחסור ועומס, הייצוג הציבורי נחווה כברירת מחדל ולא כזכות.</w:t>
+        <w:t xml:space="preserve">שני המקורות הנוספים מפתחים את הכיוון הזה משני עברים, הטכנולוגי-מוסדי והמושגי-ישראלי. סלע (Sela, 2016) מתמקדת בעיצוב המוסדי ומראה כיצד בתי משפט מקוונים יכולים לתת מענה לקשייהם של מתדיינים המייצגים את עצמם, אלה שההליך המסורתי יקר, מסורבל ומרתיע מדי עבורם. ממחקרה עולה שעיצוב נכון של סביבת ההתדיינות משפר את חוויית ההליך ההוגן של בעלי דין לא מיוצגים, כלומר שהנגישות תלויה במבנה הממשק שבין האזרח למערכת. מור (2016) מציעה את התשתית המושגית לדיון הישראלי ומבחינה בין שלוש רמות של נגישות: גישה לערכאות, נגישות למשפט ונגישות לצדק, שהיא התוצאה ההוגנת בפועל. מניתוחה, הנשען על ביקורת המוגבלות, עולה שחסמים בדרך אל הצדק אינם תקלה נקודתית אלא מאפיין מבני של האופן שבו המערכת תוכננה, ולכן הסרתם דורשת עיצוב מחדש של המוסדות ולא רק סיוע פרטני. חיבור שני המקורות מלמד שהנגישות מוכרעת בשני מפגשים: בין האזרח למוסד, ובין האזרח למושג הצדק שהוא נושא עימו. כאשר המפגשים האלה מתווכים על ידי מחסור ועומס, הייצוג הציבורי נחווה כברירת מחדל ולא כזכות.</w:t>
       </w:r>
     </w:p>
     <w:p>
@@ -482,7 +482,7 @@
           <w:szCs w:val="24"/>
           <w:rtl/>
         </w:rPr>
-        <w:t xml:space="preserve">אלבין, ע' (2016). מבוא: על נגישות למשפט ונגישות לצדק. </w:t>
+        <w:t xml:space="preserve">מור, ש' (2016). משפט נגיש לכל: הזכות לנגישות ונגישות למשפט - ביקורת מוגבלות. </w:t>
       </w:r>
       <w:r>
         <w:rPr>
@@ -505,7 +505,7 @@
           <w:szCs w:val="24"/>
           <w:rtl/>
         </w:rPr>
-        <w:t xml:space="preserve">, 5-14. זמין במאגר המשפטי נבו.</w:t>
+        <w:t xml:space="preserve">, 15-83. זמין במאגר המשפטי נבו.</w:t>
       </w:r>
     </w:p>
     <w:p>
@@ -515,7 +515,7 @@
         <w:ind w:left="709"/>
         <w:jc w:val="left"/>
       </w:pPr>
-      <w:hyperlink w:history="1" r:id="rIdbhwkdu1pnajbaif-nkesy">
+      <w:hyperlink w:history="1" r:id="rIdjpztcnyxsffgkilie4nzg">
         <w:r>
           <w:rPr>
             <w:rStyle w:val="Hyperlink"/>
@@ -523,7 +523,7 @@
             <w:sz w:val="22"/>
             <w:szCs w:val="22"/>
           </w:rPr>
-          <w:t xml:space="preserve">https://www.nevo.co.il/books/כתבי עת/כתבי עת/חוקים/גליון ח/hukim-08-005.pdf</w:t>
+          <w:t xml:space="preserve">https://law.haifa.ac.il/images/documents/Trial_Accessible%20to%20all.pdf</w:t>
         </w:r>
       </w:hyperlink>
     </w:p>
@@ -576,7 +576,7 @@
         <w:ind w:left="709"/>
         <w:jc w:val="left"/>
       </w:pPr>
-      <w:hyperlink w:history="1" r:id="rIdlolmto8wsblntkkyqjerl">
+      <w:hyperlink w:history="1" r:id="rIdezdals89nljfb3c-zu59k">
         <w:r>
           <w:rPr>
             <w:rStyle w:val="Hyperlink"/>
@@ -637,7 +637,7 @@
         <w:ind w:left="709"/>
         <w:jc w:val="left"/>
       </w:pPr>
-      <w:hyperlink w:history="1" r:id="rIdofcxyx9od1b_qzaauimq1">
+      <w:hyperlink w:history="1" r:id="rIdpeovaqnromtcuyl6kz7md">
         <w:r>
           <w:rPr>
             <w:rStyle w:val="Hyperlink"/>

</xml_diff>

<commit_message>
Add appendices with cited article pages to both assignments
Each assignment now ends with an appendix section containing full-page
images of the pages actually relied on: Sandefur 2019 in full and the
opening pages of Mor 2016 in Hadar's file; the opening pages of
Chua & Engel 2019 and Peleg 2022 in Lini's file. Page images were
rendered from the article PDFs the user supplied.

Co-Authored-By: Claude Fable 5 <noreply@anthropic.com>
Claude-Session: https://claude.ai/code/session_01JBE53LuiqYDoXy9kPJLxew
</commit_message>
<xml_diff>
--- a/seminar-papers/עבודה מסכמת - קריאה וכתיבה אקדמית ב - הדר פוקס.docx
+++ b/seminar-papers/עבודה מסכמת - קריאה וכתיבה אקדמית ב - הדר פוקס.docx
@@ -269,7 +269,7 @@
         <w:ind w:left="709"/>
         <w:jc w:val="left"/>
       </w:pPr>
-      <w:hyperlink w:history="1" r:id="rIdutpxgzhhsf5cohawiwxzb">
+      <w:hyperlink w:history="1" r:id="rId6neqjvfh6milnhalj_lav">
         <w:r>
           <w:rPr>
             <w:rStyle w:val="Hyperlink"/>
@@ -306,7 +306,7 @@
         <w:ind w:left="709"/>
         <w:jc w:val="left"/>
       </w:pPr>
-      <w:hyperlink w:history="1" r:id="rIddfpwt12v-2l8r_3qhtzpv">
+      <w:hyperlink w:history="1" r:id="rIdweqts7yau-mgroproperq">
         <w:r>
           <w:rPr>
             <w:rStyle w:val="Hyperlink"/>
@@ -343,7 +343,7 @@
         <w:ind w:left="709"/>
         <w:jc w:val="left"/>
       </w:pPr>
-      <w:hyperlink w:history="1" r:id="rIdag9akm_cosafppev-2t3w">
+      <w:hyperlink w:history="1" r:id="rIdnaw-vnmljokqpzixke_z3">
         <w:r>
           <w:rPr>
             <w:rStyle w:val="Hyperlink"/>
@@ -515,7 +515,7 @@
         <w:ind w:left="709"/>
         <w:jc w:val="left"/>
       </w:pPr>
-      <w:hyperlink w:history="1" r:id="rIdjpztcnyxsffgkilie4nzg">
+      <w:hyperlink w:history="1" r:id="rIdlpkjupbb09drxyz3vcw2j">
         <w:r>
           <w:rPr>
             <w:rStyle w:val="Hyperlink"/>
@@ -576,7 +576,7 @@
         <w:ind w:left="709"/>
         <w:jc w:val="left"/>
       </w:pPr>
-      <w:hyperlink w:history="1" r:id="rIdezdals89nljfb3c-zu59k">
+      <w:hyperlink w:history="1" r:id="rIdrfssu1ohsrfgitsffesb3">
         <w:r>
           <w:rPr>
             <w:rStyle w:val="Hyperlink"/>
@@ -637,7 +637,7 @@
         <w:ind w:left="709"/>
         <w:jc w:val="left"/>
       </w:pPr>
-      <w:hyperlink w:history="1" r:id="rIdpeovaqnromtcuyl6kz7md">
+      <w:hyperlink w:history="1" r:id="rIdzoryw0bclzblogll0kvj4">
         <w:r>
           <w:rPr>
             <w:rStyle w:val="Hyperlink"/>
@@ -648,6 +648,590 @@
           <w:t xml:space="preserve">https://doi.org/10.1162/daed_a_00534</w:t>
         </w:r>
       </w:hyperlink>
+    </w:p>
+    <w:p>
+      <w:pPr>
+        <w:pageBreakBefore/>
+        <w:bidi/>
+        <w:spacing w:after="240" w:line="360" w:lineRule="auto"/>
+        <w:jc w:val="start"/>
+      </w:pPr>
+      <w:r>
+        <w:rPr>
+          <w:rFonts w:ascii="Times New Roman" w:cs="David" w:eastAsia="David" w:hAnsi="Times New Roman"/>
+          <w:b/>
+          <w:bCs/>
+          <w:i w:val="false"/>
+          <w:sz w:val="32"/>
+          <w:szCs w:val="32"/>
+          <w:rtl/>
+        </w:rPr>
+        <w:t xml:space="preserve">נספחים</w:t>
+      </w:r>
+    </w:p>
+    <w:p>
+      <w:pPr>
+        <w:bidi/>
+        <w:spacing w:after="120" w:line="360" w:lineRule="auto"/>
+        <w:jc w:val="both"/>
+      </w:pPr>
+      <w:r>
+        <w:rPr>
+          <w:rFonts w:ascii="Times New Roman" w:cs="David" w:eastAsia="David" w:hAnsi="Times New Roman"/>
+          <w:b w:val="false"/>
+          <w:i w:val="false"/>
+          <w:sz w:val="24"/>
+          <w:szCs w:val="24"/>
+          <w:rtl/>
+        </w:rPr>
+        <w:t xml:space="preserve">להלן העמודים המרכזיים מן הפריטים האקדמיים ששימשו לכתיבת ראש הפרק. הפריטים המלאים מצורפים לתיבת ההגשה כנדרש בהנחיות.</w:t>
+      </w:r>
+    </w:p>
+    <w:p>
+      <w:pPr>
+        <w:bidi/>
+        <w:spacing w:after="120" w:line="360" w:lineRule="auto"/>
+        <w:jc w:val="start"/>
+      </w:pPr>
+      <w:r>
+        <w:rPr>
+          <w:rFonts w:ascii="Times New Roman" w:cs="David" w:eastAsia="David" w:hAnsi="Times New Roman"/>
+          <w:b/>
+          <w:bCs/>
+          <w:i w:val="false"/>
+          <w:sz w:val="24"/>
+          <w:szCs w:val="24"/>
+          <w:u w:val="single"/>
+          <w:rtl/>
+        </w:rPr>
+        <w:t xml:space="preserve">נספח א: Sandefur (2019), המאמר המלא</w:t>
+      </w:r>
+    </w:p>
+    <w:p>
+      <w:pPr>
+        <w:spacing w:after="60"/>
+        <w:jc w:val="center"/>
+      </w:pPr>
+      <w:r>
+        <w:drawing>
+          <wp:inline distT="0" distB="0" distL="0" distR="0">
+            <wp:extent cx="4810125" cy="6800850"/>
+            <wp:effectExtent t="0" r="0" b="0" l="0"/>
+            <wp:docPr id="1" name="" descr="" title=""/>
+            <wp:cNvGraphicFramePr>
+              <a:graphicFrameLocks xmlns:a="http://schemas.openxmlformats.org/drawingml/2006/main" noChangeAspect="1"/>
+            </wp:cNvGraphicFramePr>
+            <a:graphic xmlns:a="http://schemas.openxmlformats.org/drawingml/2006/main">
+              <a:graphicData uri="http://schemas.openxmlformats.org/drawingml/2006/picture">
+                <pic:pic xmlns:pic="http://schemas.openxmlformats.org/drawingml/2006/picture">
+                  <pic:nvPicPr>
+                    <pic:cNvPr id="0" name="" descr=""/>
+                    <pic:cNvPicPr>
+                      <a:picLocks noChangeAspect="1" noChangeArrowheads="1"/>
+                    </pic:cNvPicPr>
+                  </pic:nvPicPr>
+                  <pic:blipFill>
+                    <a:blip r:embed="rId9" cstate="none"/>
+                    <a:srcRect/>
+                    <a:stretch>
+                      <a:fillRect/>
+                    </a:stretch>
+                  </pic:blipFill>
+                  <pic:spPr bwMode="auto">
+                    <a:xfrm>
+                      <a:off x="0" y="0"/>
+                      <a:ext cx="4810125" cy="6800850"/>
+                    </a:xfrm>
+                    <a:prstGeom prst="rect">
+                      <a:avLst/>
+                    </a:prstGeom>
+                  </pic:spPr>
+                </pic:pic>
+              </a:graphicData>
+            </a:graphic>
+          </wp:inline>
+        </w:drawing>
+      </w:r>
+    </w:p>
+    <w:p>
+      <w:pPr>
+        <w:spacing w:after="60"/>
+        <w:jc w:val="center"/>
+      </w:pPr>
+      <w:r>
+        <w:drawing>
+          <wp:inline distT="0" distB="0" distL="0" distR="0">
+            <wp:extent cx="4810125" cy="6800850"/>
+            <wp:effectExtent t="0" r="0" b="0" l="0"/>
+            <wp:docPr id="1" name="" descr="" title=""/>
+            <wp:cNvGraphicFramePr>
+              <a:graphicFrameLocks xmlns:a="http://schemas.openxmlformats.org/drawingml/2006/main" noChangeAspect="1"/>
+            </wp:cNvGraphicFramePr>
+            <a:graphic xmlns:a="http://schemas.openxmlformats.org/drawingml/2006/main">
+              <a:graphicData uri="http://schemas.openxmlformats.org/drawingml/2006/picture">
+                <pic:pic xmlns:pic="http://schemas.openxmlformats.org/drawingml/2006/picture">
+                  <pic:nvPicPr>
+                    <pic:cNvPr id="0" name="" descr=""/>
+                    <pic:cNvPicPr>
+                      <a:picLocks noChangeAspect="1" noChangeArrowheads="1"/>
+                    </pic:cNvPicPr>
+                  </pic:nvPicPr>
+                  <pic:blipFill>
+                    <a:blip r:embed="rId10" cstate="none"/>
+                    <a:srcRect/>
+                    <a:stretch>
+                      <a:fillRect/>
+                    </a:stretch>
+                  </pic:blipFill>
+                  <pic:spPr bwMode="auto">
+                    <a:xfrm>
+                      <a:off x="0" y="0"/>
+                      <a:ext cx="4810125" cy="6800850"/>
+                    </a:xfrm>
+                    <a:prstGeom prst="rect">
+                      <a:avLst/>
+                    </a:prstGeom>
+                  </pic:spPr>
+                </pic:pic>
+              </a:graphicData>
+            </a:graphic>
+          </wp:inline>
+        </w:drawing>
+      </w:r>
+    </w:p>
+    <w:p>
+      <w:pPr>
+        <w:spacing w:after="60"/>
+        <w:jc w:val="center"/>
+      </w:pPr>
+      <w:r>
+        <w:drawing>
+          <wp:inline distT="0" distB="0" distL="0" distR="0">
+            <wp:extent cx="4810125" cy="6800850"/>
+            <wp:effectExtent t="0" r="0" b="0" l="0"/>
+            <wp:docPr id="1" name="" descr="" title=""/>
+            <wp:cNvGraphicFramePr>
+              <a:graphicFrameLocks xmlns:a="http://schemas.openxmlformats.org/drawingml/2006/main" noChangeAspect="1"/>
+            </wp:cNvGraphicFramePr>
+            <a:graphic xmlns:a="http://schemas.openxmlformats.org/drawingml/2006/main">
+              <a:graphicData uri="http://schemas.openxmlformats.org/drawingml/2006/picture">
+                <pic:pic xmlns:pic="http://schemas.openxmlformats.org/drawingml/2006/picture">
+                  <pic:nvPicPr>
+                    <pic:cNvPr id="0" name="" descr=""/>
+                    <pic:cNvPicPr>
+                      <a:picLocks noChangeAspect="1" noChangeArrowheads="1"/>
+                    </pic:cNvPicPr>
+                  </pic:nvPicPr>
+                  <pic:blipFill>
+                    <a:blip r:embed="rId11" cstate="none"/>
+                    <a:srcRect/>
+                    <a:stretch>
+                      <a:fillRect/>
+                    </a:stretch>
+                  </pic:blipFill>
+                  <pic:spPr bwMode="auto">
+                    <a:xfrm>
+                      <a:off x="0" y="0"/>
+                      <a:ext cx="4810125" cy="6800850"/>
+                    </a:xfrm>
+                    <a:prstGeom prst="rect">
+                      <a:avLst/>
+                    </a:prstGeom>
+                  </pic:spPr>
+                </pic:pic>
+              </a:graphicData>
+            </a:graphic>
+          </wp:inline>
+        </w:drawing>
+      </w:r>
+    </w:p>
+    <w:p>
+      <w:pPr>
+        <w:spacing w:after="60"/>
+        <w:jc w:val="center"/>
+      </w:pPr>
+      <w:r>
+        <w:drawing>
+          <wp:inline distT="0" distB="0" distL="0" distR="0">
+            <wp:extent cx="4810125" cy="6800850"/>
+            <wp:effectExtent t="0" r="0" b="0" l="0"/>
+            <wp:docPr id="1" name="" descr="" title=""/>
+            <wp:cNvGraphicFramePr>
+              <a:graphicFrameLocks xmlns:a="http://schemas.openxmlformats.org/drawingml/2006/main" noChangeAspect="1"/>
+            </wp:cNvGraphicFramePr>
+            <a:graphic xmlns:a="http://schemas.openxmlformats.org/drawingml/2006/main">
+              <a:graphicData uri="http://schemas.openxmlformats.org/drawingml/2006/picture">
+                <pic:pic xmlns:pic="http://schemas.openxmlformats.org/drawingml/2006/picture">
+                  <pic:nvPicPr>
+                    <pic:cNvPr id="0" name="" descr=""/>
+                    <pic:cNvPicPr>
+                      <a:picLocks noChangeAspect="1" noChangeArrowheads="1"/>
+                    </pic:cNvPicPr>
+                  </pic:nvPicPr>
+                  <pic:blipFill>
+                    <a:blip r:embed="rId12" cstate="none"/>
+                    <a:srcRect/>
+                    <a:stretch>
+                      <a:fillRect/>
+                    </a:stretch>
+                  </pic:blipFill>
+                  <pic:spPr bwMode="auto">
+                    <a:xfrm>
+                      <a:off x="0" y="0"/>
+                      <a:ext cx="4810125" cy="6800850"/>
+                    </a:xfrm>
+                    <a:prstGeom prst="rect">
+                      <a:avLst/>
+                    </a:prstGeom>
+                  </pic:spPr>
+                </pic:pic>
+              </a:graphicData>
+            </a:graphic>
+          </wp:inline>
+        </w:drawing>
+      </w:r>
+    </w:p>
+    <w:p>
+      <w:pPr>
+        <w:spacing w:after="60"/>
+        <w:jc w:val="center"/>
+      </w:pPr>
+      <w:r>
+        <w:drawing>
+          <wp:inline distT="0" distB="0" distL="0" distR="0">
+            <wp:extent cx="4810125" cy="6800850"/>
+            <wp:effectExtent t="0" r="0" b="0" l="0"/>
+            <wp:docPr id="1" name="" descr="" title=""/>
+            <wp:cNvGraphicFramePr>
+              <a:graphicFrameLocks xmlns:a="http://schemas.openxmlformats.org/drawingml/2006/main" noChangeAspect="1"/>
+            </wp:cNvGraphicFramePr>
+            <a:graphic xmlns:a="http://schemas.openxmlformats.org/drawingml/2006/main">
+              <a:graphicData uri="http://schemas.openxmlformats.org/drawingml/2006/picture">
+                <pic:pic xmlns:pic="http://schemas.openxmlformats.org/drawingml/2006/picture">
+                  <pic:nvPicPr>
+                    <pic:cNvPr id="0" name="" descr=""/>
+                    <pic:cNvPicPr>
+                      <a:picLocks noChangeAspect="1" noChangeArrowheads="1"/>
+                    </pic:cNvPicPr>
+                  </pic:nvPicPr>
+                  <pic:blipFill>
+                    <a:blip r:embed="rId13" cstate="none"/>
+                    <a:srcRect/>
+                    <a:stretch>
+                      <a:fillRect/>
+                    </a:stretch>
+                  </pic:blipFill>
+                  <pic:spPr bwMode="auto">
+                    <a:xfrm>
+                      <a:off x="0" y="0"/>
+                      <a:ext cx="4810125" cy="6800850"/>
+                    </a:xfrm>
+                    <a:prstGeom prst="rect">
+                      <a:avLst/>
+                    </a:prstGeom>
+                  </pic:spPr>
+                </pic:pic>
+              </a:graphicData>
+            </a:graphic>
+          </wp:inline>
+        </w:drawing>
+      </w:r>
+    </w:p>
+    <w:p>
+      <w:pPr>
+        <w:spacing w:after="60"/>
+        <w:jc w:val="center"/>
+      </w:pPr>
+      <w:r>
+        <w:drawing>
+          <wp:inline distT="0" distB="0" distL="0" distR="0">
+            <wp:extent cx="4810125" cy="6800850"/>
+            <wp:effectExtent t="0" r="0" b="0" l="0"/>
+            <wp:docPr id="1" name="" descr="" title=""/>
+            <wp:cNvGraphicFramePr>
+              <a:graphicFrameLocks xmlns:a="http://schemas.openxmlformats.org/drawingml/2006/main" noChangeAspect="1"/>
+            </wp:cNvGraphicFramePr>
+            <a:graphic xmlns:a="http://schemas.openxmlformats.org/drawingml/2006/main">
+              <a:graphicData uri="http://schemas.openxmlformats.org/drawingml/2006/picture">
+                <pic:pic xmlns:pic="http://schemas.openxmlformats.org/drawingml/2006/picture">
+                  <pic:nvPicPr>
+                    <pic:cNvPr id="0" name="" descr=""/>
+                    <pic:cNvPicPr>
+                      <a:picLocks noChangeAspect="1" noChangeArrowheads="1"/>
+                    </pic:cNvPicPr>
+                  </pic:nvPicPr>
+                  <pic:blipFill>
+                    <a:blip r:embed="rId14" cstate="none"/>
+                    <a:srcRect/>
+                    <a:stretch>
+                      <a:fillRect/>
+                    </a:stretch>
+                  </pic:blipFill>
+                  <pic:spPr bwMode="auto">
+                    <a:xfrm>
+                      <a:off x="0" y="0"/>
+                      <a:ext cx="4810125" cy="6800850"/>
+                    </a:xfrm>
+                    <a:prstGeom prst="rect">
+                      <a:avLst/>
+                    </a:prstGeom>
+                  </pic:spPr>
+                </pic:pic>
+              </a:graphicData>
+            </a:graphic>
+          </wp:inline>
+        </w:drawing>
+      </w:r>
+    </w:p>
+    <w:p>
+      <w:pPr>
+        <w:spacing w:after="60"/>
+        <w:jc w:val="center"/>
+      </w:pPr>
+      <w:r>
+        <w:drawing>
+          <wp:inline distT="0" distB="0" distL="0" distR="0">
+            <wp:extent cx="4810125" cy="6800850"/>
+            <wp:effectExtent t="0" r="0" b="0" l="0"/>
+            <wp:docPr id="1" name="" descr="" title=""/>
+            <wp:cNvGraphicFramePr>
+              <a:graphicFrameLocks xmlns:a="http://schemas.openxmlformats.org/drawingml/2006/main" noChangeAspect="1"/>
+            </wp:cNvGraphicFramePr>
+            <a:graphic xmlns:a="http://schemas.openxmlformats.org/drawingml/2006/main">
+              <a:graphicData uri="http://schemas.openxmlformats.org/drawingml/2006/picture">
+                <pic:pic xmlns:pic="http://schemas.openxmlformats.org/drawingml/2006/picture">
+                  <pic:nvPicPr>
+                    <pic:cNvPr id="0" name="" descr=""/>
+                    <pic:cNvPicPr>
+                      <a:picLocks noChangeAspect="1" noChangeArrowheads="1"/>
+                    </pic:cNvPicPr>
+                  </pic:nvPicPr>
+                  <pic:blipFill>
+                    <a:blip r:embed="rId15" cstate="none"/>
+                    <a:srcRect/>
+                    <a:stretch>
+                      <a:fillRect/>
+                    </a:stretch>
+                  </pic:blipFill>
+                  <pic:spPr bwMode="auto">
+                    <a:xfrm>
+                      <a:off x="0" y="0"/>
+                      <a:ext cx="4810125" cy="6800850"/>
+                    </a:xfrm>
+                    <a:prstGeom prst="rect">
+                      <a:avLst/>
+                    </a:prstGeom>
+                  </pic:spPr>
+                </pic:pic>
+              </a:graphicData>
+            </a:graphic>
+          </wp:inline>
+        </w:drawing>
+      </w:r>
+    </w:p>
+    <w:p>
+      <w:pPr>
+        <w:bidi/>
+        <w:spacing w:after="120" w:line="360" w:lineRule="auto"/>
+        <w:jc w:val="start"/>
+      </w:pPr>
+      <w:r>
+        <w:rPr>
+          <w:rFonts w:ascii="Times New Roman" w:cs="David" w:eastAsia="David" w:hAnsi="Times New Roman"/>
+          <w:b/>
+          <w:bCs/>
+          <w:i w:val="false"/>
+          <w:sz w:val="24"/>
+          <w:szCs w:val="24"/>
+          <w:u w:val="single"/>
+          <w:rtl/>
+        </w:rPr>
+        <w:t xml:space="preserve">נספח ב: מור (2016), עמ' 15-18 (תקציר, מבוא וההבחנה בין שלושת מישורי הנגישות)</w:t>
+      </w:r>
+    </w:p>
+    <w:p>
+      <w:pPr>
+        <w:spacing w:after="60"/>
+        <w:jc w:val="center"/>
+      </w:pPr>
+      <w:r>
+        <w:drawing>
+          <wp:inline distT="0" distB="0" distL="0" distR="0">
+            <wp:extent cx="4810125" cy="6800850"/>
+            <wp:effectExtent t="0" r="0" b="0" l="0"/>
+            <wp:docPr id="1" name="" descr="" title=""/>
+            <wp:cNvGraphicFramePr>
+              <a:graphicFrameLocks xmlns:a="http://schemas.openxmlformats.org/drawingml/2006/main" noChangeAspect="1"/>
+            </wp:cNvGraphicFramePr>
+            <a:graphic xmlns:a="http://schemas.openxmlformats.org/drawingml/2006/main">
+              <a:graphicData uri="http://schemas.openxmlformats.org/drawingml/2006/picture">
+                <pic:pic xmlns:pic="http://schemas.openxmlformats.org/drawingml/2006/picture">
+                  <pic:nvPicPr>
+                    <pic:cNvPr id="0" name="" descr=""/>
+                    <pic:cNvPicPr>
+                      <a:picLocks noChangeAspect="1" noChangeArrowheads="1"/>
+                    </pic:cNvPicPr>
+                  </pic:nvPicPr>
+                  <pic:blipFill>
+                    <a:blip r:embed="rId16" cstate="none"/>
+                    <a:srcRect/>
+                    <a:stretch>
+                      <a:fillRect/>
+                    </a:stretch>
+                  </pic:blipFill>
+                  <pic:spPr bwMode="auto">
+                    <a:xfrm>
+                      <a:off x="0" y="0"/>
+                      <a:ext cx="4810125" cy="6800850"/>
+                    </a:xfrm>
+                    <a:prstGeom prst="rect">
+                      <a:avLst/>
+                    </a:prstGeom>
+                  </pic:spPr>
+                </pic:pic>
+              </a:graphicData>
+            </a:graphic>
+          </wp:inline>
+        </w:drawing>
+      </w:r>
+    </w:p>
+    <w:p>
+      <w:pPr>
+        <w:spacing w:after="60"/>
+        <w:jc w:val="center"/>
+      </w:pPr>
+      <w:r>
+        <w:drawing>
+          <wp:inline distT="0" distB="0" distL="0" distR="0">
+            <wp:extent cx="4810125" cy="6800850"/>
+            <wp:effectExtent t="0" r="0" b="0" l="0"/>
+            <wp:docPr id="1" name="" descr="" title=""/>
+            <wp:cNvGraphicFramePr>
+              <a:graphicFrameLocks xmlns:a="http://schemas.openxmlformats.org/drawingml/2006/main" noChangeAspect="1"/>
+            </wp:cNvGraphicFramePr>
+            <a:graphic xmlns:a="http://schemas.openxmlformats.org/drawingml/2006/main">
+              <a:graphicData uri="http://schemas.openxmlformats.org/drawingml/2006/picture">
+                <pic:pic xmlns:pic="http://schemas.openxmlformats.org/drawingml/2006/picture">
+                  <pic:nvPicPr>
+                    <pic:cNvPr id="0" name="" descr=""/>
+                    <pic:cNvPicPr>
+                      <a:picLocks noChangeAspect="1" noChangeArrowheads="1"/>
+                    </pic:cNvPicPr>
+                  </pic:nvPicPr>
+                  <pic:blipFill>
+                    <a:blip r:embed="rId17" cstate="none"/>
+                    <a:srcRect/>
+                    <a:stretch>
+                      <a:fillRect/>
+                    </a:stretch>
+                  </pic:blipFill>
+                  <pic:spPr bwMode="auto">
+                    <a:xfrm>
+                      <a:off x="0" y="0"/>
+                      <a:ext cx="4810125" cy="6800850"/>
+                    </a:xfrm>
+                    <a:prstGeom prst="rect">
+                      <a:avLst/>
+                    </a:prstGeom>
+                  </pic:spPr>
+                </pic:pic>
+              </a:graphicData>
+            </a:graphic>
+          </wp:inline>
+        </w:drawing>
+      </w:r>
+    </w:p>
+    <w:p>
+      <w:pPr>
+        <w:spacing w:after="60"/>
+        <w:jc w:val="center"/>
+      </w:pPr>
+      <w:r>
+        <w:drawing>
+          <wp:inline distT="0" distB="0" distL="0" distR="0">
+            <wp:extent cx="4810125" cy="6800850"/>
+            <wp:effectExtent t="0" r="0" b="0" l="0"/>
+            <wp:docPr id="1" name="" descr="" title=""/>
+            <wp:cNvGraphicFramePr>
+              <a:graphicFrameLocks xmlns:a="http://schemas.openxmlformats.org/drawingml/2006/main" noChangeAspect="1"/>
+            </wp:cNvGraphicFramePr>
+            <a:graphic xmlns:a="http://schemas.openxmlformats.org/drawingml/2006/main">
+              <a:graphicData uri="http://schemas.openxmlformats.org/drawingml/2006/picture">
+                <pic:pic xmlns:pic="http://schemas.openxmlformats.org/drawingml/2006/picture">
+                  <pic:nvPicPr>
+                    <pic:cNvPr id="0" name="" descr=""/>
+                    <pic:cNvPicPr>
+                      <a:picLocks noChangeAspect="1" noChangeArrowheads="1"/>
+                    </pic:cNvPicPr>
+                  </pic:nvPicPr>
+                  <pic:blipFill>
+                    <a:blip r:embed="rId18" cstate="none"/>
+                    <a:srcRect/>
+                    <a:stretch>
+                      <a:fillRect/>
+                    </a:stretch>
+                  </pic:blipFill>
+                  <pic:spPr bwMode="auto">
+                    <a:xfrm>
+                      <a:off x="0" y="0"/>
+                      <a:ext cx="4810125" cy="6800850"/>
+                    </a:xfrm>
+                    <a:prstGeom prst="rect">
+                      <a:avLst/>
+                    </a:prstGeom>
+                  </pic:spPr>
+                </pic:pic>
+              </a:graphicData>
+            </a:graphic>
+          </wp:inline>
+        </w:drawing>
+      </w:r>
+    </w:p>
+    <w:p>
+      <w:pPr>
+        <w:spacing w:after="60"/>
+        <w:jc w:val="center"/>
+      </w:pPr>
+      <w:r>
+        <w:drawing>
+          <wp:inline distT="0" distB="0" distL="0" distR="0">
+            <wp:extent cx="4810125" cy="6800850"/>
+            <wp:effectExtent t="0" r="0" b="0" l="0"/>
+            <wp:docPr id="1" name="" descr="" title=""/>
+            <wp:cNvGraphicFramePr>
+              <a:graphicFrameLocks xmlns:a="http://schemas.openxmlformats.org/drawingml/2006/main" noChangeAspect="1"/>
+            </wp:cNvGraphicFramePr>
+            <a:graphic xmlns:a="http://schemas.openxmlformats.org/drawingml/2006/main">
+              <a:graphicData uri="http://schemas.openxmlformats.org/drawingml/2006/picture">
+                <pic:pic xmlns:pic="http://schemas.openxmlformats.org/drawingml/2006/picture">
+                  <pic:nvPicPr>
+                    <pic:cNvPr id="0" name="" descr=""/>
+                    <pic:cNvPicPr>
+                      <a:picLocks noChangeAspect="1" noChangeArrowheads="1"/>
+                    </pic:cNvPicPr>
+                  </pic:nvPicPr>
+                  <pic:blipFill>
+                    <a:blip r:embed="rId19" cstate="none"/>
+                    <a:srcRect/>
+                    <a:stretch>
+                      <a:fillRect/>
+                    </a:stretch>
+                  </pic:blipFill>
+                  <pic:spPr bwMode="auto">
+                    <a:xfrm>
+                      <a:off x="0" y="0"/>
+                      <a:ext cx="4810125" cy="6800850"/>
+                    </a:xfrm>
+                    <a:prstGeom prst="rect">
+                      <a:avLst/>
+                    </a:prstGeom>
+                  </pic:spPr>
+                </pic:pic>
+              </a:graphicData>
+            </a:graphic>
+          </wp:inline>
+        </w:drawing>
+      </w:r>
     </w:p>
     <w:sectPr>
       <w:headerReference w:type="default" r:id="rId7"/>

</xml_diff>

<commit_message>
Add Nadiv appendix to Lini's assignment and fix appendix pagination
Adds the opening pages of Nadiv as appendix C from the user-supplied
PDF, corrects the Nadiv citation year to 2023 per the printed volume,
and starts each appendix after the first on a fresh page so headings
are no longer orphaned.

Co-Authored-By: Claude Fable 5 <noreply@anthropic.com>
Claude-Session: https://claude.ai/code/session_01JBE53LuiqYDoXy9kPJLxew
</commit_message>
<xml_diff>
--- a/seminar-papers/עבודה מסכמת - קריאה וכתיבה אקדמית ב - הדר פוקס.docx
+++ b/seminar-papers/עבודה מסכמת - קריאה וכתיבה אקדמית ב - הדר פוקס.docx
@@ -269,7 +269,7 @@
         <w:ind w:left="709"/>
         <w:jc w:val="left"/>
       </w:pPr>
-      <w:hyperlink w:history="1" r:id="rId6neqjvfh6milnhalj_lav">
+      <w:hyperlink w:history="1" r:id="rIddphlygreo5hzr35mkjvhn">
         <w:r>
           <w:rPr>
             <w:rStyle w:val="Hyperlink"/>
@@ -306,7 +306,7 @@
         <w:ind w:left="709"/>
         <w:jc w:val="left"/>
       </w:pPr>
-      <w:hyperlink w:history="1" r:id="rIdweqts7yau-mgroproperq">
+      <w:hyperlink w:history="1" r:id="rIdnznb0peoc82v5nftrsisg">
         <w:r>
           <w:rPr>
             <w:rStyle w:val="Hyperlink"/>
@@ -343,7 +343,7 @@
         <w:ind w:left="709"/>
         <w:jc w:val="left"/>
       </w:pPr>
-      <w:hyperlink w:history="1" r:id="rIdnaw-vnmljokqpzixke_z3">
+      <w:hyperlink w:history="1" r:id="rIdf0f-sy4fjlma6obqcchs2">
         <w:r>
           <w:rPr>
             <w:rStyle w:val="Hyperlink"/>
@@ -515,7 +515,7 @@
         <w:ind w:left="709"/>
         <w:jc w:val="left"/>
       </w:pPr>
-      <w:hyperlink w:history="1" r:id="rIdlpkjupbb09drxyz3vcw2j">
+      <w:hyperlink w:history="1" r:id="rIdyvvfiocuj5eh9k-1upsqm">
         <w:r>
           <w:rPr>
             <w:rStyle w:val="Hyperlink"/>
@@ -576,7 +576,7 @@
         <w:ind w:left="709"/>
         <w:jc w:val="left"/>
       </w:pPr>
-      <w:hyperlink w:history="1" r:id="rIdrfssu1ohsrfgitsffesb3">
+      <w:hyperlink w:history="1" r:id="rIdzcrbtipudzvbrlasmebdc">
         <w:r>
           <w:rPr>
             <w:rStyle w:val="Hyperlink"/>
@@ -637,7 +637,7 @@
         <w:ind w:left="709"/>
         <w:jc w:val="left"/>
       </w:pPr>
-      <w:hyperlink w:history="1" r:id="rIdzoryw0bclzblogll0kvj4">
+      <w:hyperlink w:history="1" r:id="rIdllt9q6sh0hnmpeo8kvg1p">
         <w:r>
           <w:rPr>
             <w:rStyle w:val="Hyperlink"/>
@@ -1031,6 +1031,7 @@
     </w:p>
     <w:p>
       <w:pPr>
+        <w:pageBreakBefore/>
         <w:bidi/>
         <w:spacing w:after="120" w:line="360" w:lineRule="auto"/>
         <w:jc w:val="start"/>

</xml_diff>

<commit_message>
Add Sela appendix, completing both assignments
Appendix C in Hadar's assignment now carries the Cornell repository
cover page and the opening pages of Sela 2016, so each assignment has
one appendix per cited source.

Co-Authored-By: Claude Opus 5 <noreply@anthropic.com>
Claude-Session: https://claude.ai/code/session_01JBE53LuiqYDoXy9kPJLxew
</commit_message>
<xml_diff>
--- a/seminar-papers/עבודה מסכמת - קריאה וכתיבה אקדמית ב - הדר פוקס.docx
+++ b/seminar-papers/עבודה מסכמת - קריאה וכתיבה אקדמית ב - הדר פוקס.docx
@@ -269,7 +269,7 @@
         <w:ind w:left="709"/>
         <w:jc w:val="left"/>
       </w:pPr>
-      <w:hyperlink w:history="1" r:id="rIddphlygreo5hzr35mkjvhn">
+      <w:hyperlink w:history="1" r:id="rIdvalyqicj-qegld9ekwpa2">
         <w:r>
           <w:rPr>
             <w:rStyle w:val="Hyperlink"/>
@@ -306,7 +306,7 @@
         <w:ind w:left="709"/>
         <w:jc w:val="left"/>
       </w:pPr>
-      <w:hyperlink w:history="1" r:id="rIdnznb0peoc82v5nftrsisg">
+      <w:hyperlink w:history="1" r:id="rIdidkyfxke9d6lpuoqtn-4c">
         <w:r>
           <w:rPr>
             <w:rStyle w:val="Hyperlink"/>
@@ -343,7 +343,7 @@
         <w:ind w:left="709"/>
         <w:jc w:val="left"/>
       </w:pPr>
-      <w:hyperlink w:history="1" r:id="rIdf0f-sy4fjlma6obqcchs2">
+      <w:hyperlink w:history="1" r:id="rIdtvhp0t22sx8-qzh2ciuup">
         <w:r>
           <w:rPr>
             <w:rStyle w:val="Hyperlink"/>
@@ -515,7 +515,7 @@
         <w:ind w:left="709"/>
         <w:jc w:val="left"/>
       </w:pPr>
-      <w:hyperlink w:history="1" r:id="rIdyvvfiocuj5eh9k-1upsqm">
+      <w:hyperlink w:history="1" r:id="rIdjv4l9phat8zz1pujxqodl">
         <w:r>
           <w:rPr>
             <w:rStyle w:val="Hyperlink"/>
@@ -576,7 +576,7 @@
         <w:ind w:left="709"/>
         <w:jc w:val="left"/>
       </w:pPr>
-      <w:hyperlink w:history="1" r:id="rIdzcrbtipudzvbrlasmebdc">
+      <w:hyperlink w:history="1" r:id="rId3gud5rlrtbssxz2vfgpmd">
         <w:r>
           <w:rPr>
             <w:rStyle w:val="Hyperlink"/>
@@ -637,7 +637,7 @@
         <w:ind w:left="709"/>
         <w:jc w:val="left"/>
       </w:pPr>
-      <w:hyperlink w:history="1" r:id="rIdllt9q6sh0hnmpeo8kvg1p">
+      <w:hyperlink w:history="1" r:id="rIdprbfc1jsonexjjugukmw2">
         <w:r>
           <w:rPr>
             <w:rStyle w:val="Hyperlink"/>
@@ -1213,6 +1213,211 @@
                   </pic:nvPicPr>
                   <pic:blipFill>
                     <a:blip r:embed="rId19" cstate="none"/>
+                    <a:srcRect/>
+                    <a:stretch>
+                      <a:fillRect/>
+                    </a:stretch>
+                  </pic:blipFill>
+                  <pic:spPr bwMode="auto">
+                    <a:xfrm>
+                      <a:off x="0" y="0"/>
+                      <a:ext cx="4810125" cy="6800850"/>
+                    </a:xfrm>
+                    <a:prstGeom prst="rect">
+                      <a:avLst/>
+                    </a:prstGeom>
+                  </pic:spPr>
+                </pic:pic>
+              </a:graphicData>
+            </a:graphic>
+          </wp:inline>
+        </w:drawing>
+      </w:r>
+    </w:p>
+    <w:p>
+      <w:pPr>
+        <w:pageBreakBefore/>
+        <w:bidi/>
+        <w:spacing w:after="120" w:line="360" w:lineRule="auto"/>
+        <w:jc w:val="start"/>
+      </w:pPr>
+      <w:r>
+        <w:rPr>
+          <w:rFonts w:ascii="Times New Roman" w:cs="David" w:eastAsia="David" w:hAnsi="Times New Roman"/>
+          <w:b/>
+          <w:bCs/>
+          <w:i w:val="false"/>
+          <w:sz w:val="24"/>
+          <w:szCs w:val="24"/>
+          <w:u w:val="single"/>
+          <w:rtl/>
+        </w:rPr>
+        <w:t xml:space="preserve">נספח ג: Sela (2016), עמ' 331-333 (עמוד המאגר, פתיחת המאמר והתקציר)</w:t>
+      </w:r>
+    </w:p>
+    <w:p>
+      <w:pPr>
+        <w:spacing w:after="60"/>
+        <w:jc w:val="center"/>
+      </w:pPr>
+      <w:r>
+        <w:drawing>
+          <wp:inline distT="0" distB="0" distL="0" distR="0">
+            <wp:extent cx="4810125" cy="6800850"/>
+            <wp:effectExtent t="0" r="0" b="0" l="0"/>
+            <wp:docPr id="1" name="" descr="" title=""/>
+            <wp:cNvGraphicFramePr>
+              <a:graphicFrameLocks xmlns:a="http://schemas.openxmlformats.org/drawingml/2006/main" noChangeAspect="1"/>
+            </wp:cNvGraphicFramePr>
+            <a:graphic xmlns:a="http://schemas.openxmlformats.org/drawingml/2006/main">
+              <a:graphicData uri="http://schemas.openxmlformats.org/drawingml/2006/picture">
+                <pic:pic xmlns:pic="http://schemas.openxmlformats.org/drawingml/2006/picture">
+                  <pic:nvPicPr>
+                    <pic:cNvPr id="0" name="" descr=""/>
+                    <pic:cNvPicPr>
+                      <a:picLocks noChangeAspect="1" noChangeArrowheads="1"/>
+                    </pic:cNvPicPr>
+                  </pic:nvPicPr>
+                  <pic:blipFill>
+                    <a:blip r:embed="rId20" cstate="none"/>
+                    <a:srcRect/>
+                    <a:stretch>
+                      <a:fillRect/>
+                    </a:stretch>
+                  </pic:blipFill>
+                  <pic:spPr bwMode="auto">
+                    <a:xfrm>
+                      <a:off x="0" y="0"/>
+                      <a:ext cx="4810125" cy="6800850"/>
+                    </a:xfrm>
+                    <a:prstGeom prst="rect">
+                      <a:avLst/>
+                    </a:prstGeom>
+                  </pic:spPr>
+                </pic:pic>
+              </a:graphicData>
+            </a:graphic>
+          </wp:inline>
+        </w:drawing>
+      </w:r>
+    </w:p>
+    <w:p>
+      <w:pPr>
+        <w:spacing w:after="60"/>
+        <w:jc w:val="center"/>
+      </w:pPr>
+      <w:r>
+        <w:drawing>
+          <wp:inline distT="0" distB="0" distL="0" distR="0">
+            <wp:extent cx="4810125" cy="6800850"/>
+            <wp:effectExtent t="0" r="0" b="0" l="0"/>
+            <wp:docPr id="1" name="" descr="" title=""/>
+            <wp:cNvGraphicFramePr>
+              <a:graphicFrameLocks xmlns:a="http://schemas.openxmlformats.org/drawingml/2006/main" noChangeAspect="1"/>
+            </wp:cNvGraphicFramePr>
+            <a:graphic xmlns:a="http://schemas.openxmlformats.org/drawingml/2006/main">
+              <a:graphicData uri="http://schemas.openxmlformats.org/drawingml/2006/picture">
+                <pic:pic xmlns:pic="http://schemas.openxmlformats.org/drawingml/2006/picture">
+                  <pic:nvPicPr>
+                    <pic:cNvPr id="0" name="" descr=""/>
+                    <pic:cNvPicPr>
+                      <a:picLocks noChangeAspect="1" noChangeArrowheads="1"/>
+                    </pic:cNvPicPr>
+                  </pic:nvPicPr>
+                  <pic:blipFill>
+                    <a:blip r:embed="rId21" cstate="none"/>
+                    <a:srcRect/>
+                    <a:stretch>
+                      <a:fillRect/>
+                    </a:stretch>
+                  </pic:blipFill>
+                  <pic:spPr bwMode="auto">
+                    <a:xfrm>
+                      <a:off x="0" y="0"/>
+                      <a:ext cx="4810125" cy="6800850"/>
+                    </a:xfrm>
+                    <a:prstGeom prst="rect">
+                      <a:avLst/>
+                    </a:prstGeom>
+                  </pic:spPr>
+                </pic:pic>
+              </a:graphicData>
+            </a:graphic>
+          </wp:inline>
+        </w:drawing>
+      </w:r>
+    </w:p>
+    <w:p>
+      <w:pPr>
+        <w:spacing w:after="60"/>
+        <w:jc w:val="center"/>
+      </w:pPr>
+      <w:r>
+        <w:drawing>
+          <wp:inline distT="0" distB="0" distL="0" distR="0">
+            <wp:extent cx="4810125" cy="6800850"/>
+            <wp:effectExtent t="0" r="0" b="0" l="0"/>
+            <wp:docPr id="1" name="" descr="" title=""/>
+            <wp:cNvGraphicFramePr>
+              <a:graphicFrameLocks xmlns:a="http://schemas.openxmlformats.org/drawingml/2006/main" noChangeAspect="1"/>
+            </wp:cNvGraphicFramePr>
+            <a:graphic xmlns:a="http://schemas.openxmlformats.org/drawingml/2006/main">
+              <a:graphicData uri="http://schemas.openxmlformats.org/drawingml/2006/picture">
+                <pic:pic xmlns:pic="http://schemas.openxmlformats.org/drawingml/2006/picture">
+                  <pic:nvPicPr>
+                    <pic:cNvPr id="0" name="" descr=""/>
+                    <pic:cNvPicPr>
+                      <a:picLocks noChangeAspect="1" noChangeArrowheads="1"/>
+                    </pic:cNvPicPr>
+                  </pic:nvPicPr>
+                  <pic:blipFill>
+                    <a:blip r:embed="rId22" cstate="none"/>
+                    <a:srcRect/>
+                    <a:stretch>
+                      <a:fillRect/>
+                    </a:stretch>
+                  </pic:blipFill>
+                  <pic:spPr bwMode="auto">
+                    <a:xfrm>
+                      <a:off x="0" y="0"/>
+                      <a:ext cx="4810125" cy="6800850"/>
+                    </a:xfrm>
+                    <a:prstGeom prst="rect">
+                      <a:avLst/>
+                    </a:prstGeom>
+                  </pic:spPr>
+                </pic:pic>
+              </a:graphicData>
+            </a:graphic>
+          </wp:inline>
+        </w:drawing>
+      </w:r>
+    </w:p>
+    <w:p>
+      <w:pPr>
+        <w:spacing w:after="60"/>
+        <w:jc w:val="center"/>
+      </w:pPr>
+      <w:r>
+        <w:drawing>
+          <wp:inline distT="0" distB="0" distL="0" distR="0">
+            <wp:extent cx="4810125" cy="6800850"/>
+            <wp:effectExtent t="0" r="0" b="0" l="0"/>
+            <wp:docPr id="1" name="" descr="" title=""/>
+            <wp:cNvGraphicFramePr>
+              <a:graphicFrameLocks xmlns:a="http://schemas.openxmlformats.org/drawingml/2006/main" noChangeAspect="1"/>
+            </wp:cNvGraphicFramePr>
+            <a:graphic xmlns:a="http://schemas.openxmlformats.org/drawingml/2006/main">
+              <a:graphicData uri="http://schemas.openxmlformats.org/drawingml/2006/picture">
+                <pic:pic xmlns:pic="http://schemas.openxmlformats.org/drawingml/2006/picture">
+                  <pic:nvPicPr>
+                    <pic:cNvPr id="0" name="" descr=""/>
+                    <pic:cNvPicPr>
+                      <a:picLocks noChangeAspect="1" noChangeArrowheads="1"/>
+                    </pic:cNvPicPr>
+                  </pic:nvPicPr>
+                  <pic:blipFill>
+                    <a:blip r:embed="rId23" cstate="none"/>
                     <a:srcRect/>
                     <a:stretch>
                       <a:fillRect/>

</xml_diff>